<commit_message>
Move plan to docs and sync README with it
</commit_message>
<xml_diff>
--- a/docs/ke-hoach-cua-cuon-esp32.docx
+++ b/docs/ke-hoach-cua-cuon-esp32.docx
@@ -318,7 +318,63 @@
           <w:sz w:val="22"/>
           <w:szCs w:val="22"/>
         </w:rPr>
-        <w:t xml:space="preserve">Android native, Kotlin và Jetpack Compose, tối thiểu Android 12.</w:t>
+        <w:t xml:space="preserve">Android native, Kotlin và Jetpack Compose, tối thiểu Android 8 (API 26), thử nghiệm trên máy Android 11.</w:t>
+      </w:r>
+    </w:p>
+    <w:p>
+      <w:pPr>
+        <w:pStyle w:val="ListParagraph"/>
+        <w:numPr>
+          <w:ilvl w:val="0"/>
+          <w:numId w:val="2"/>
+        </w:numPr>
+        <w:spacing w:after="70"/>
+      </w:pPr>
+      <w:r>
+        <w:rPr>
+          <w:rFonts w:ascii="Arial" w:cs="Arial" w:eastAsia="Arial" w:hAnsi="Arial"/>
+          <w:b/>
+          <w:bCs/>
+          <w:sz w:val="22"/>
+          <w:szCs w:val="22"/>
+        </w:rPr>
+        <w:t xml:space="preserve">Quyền Bluetooth: </w:t>
+      </w:r>
+      <w:r>
+        <w:rPr>
+          <w:rFonts w:ascii="Arial" w:cs="Arial" w:eastAsia="Arial" w:hAnsi="Arial"/>
+          <w:sz w:val="22"/>
+          <w:szCs w:val="22"/>
+        </w:rPr>
+        <w:t xml:space="preserve">Android 11 trở xuống cần quyền vị trí và bật định vị khi quét thiết bị lúc ghép đôi; Android 12 trở lên dùng quyền Bluetooth riêng. App khai báo cả hai bộ quyền.</w:t>
+      </w:r>
+    </w:p>
+    <w:p>
+      <w:pPr>
+        <w:pStyle w:val="ListParagraph"/>
+        <w:numPr>
+          <w:ilvl w:val="0"/>
+          <w:numId w:val="2"/>
+        </w:numPr>
+        <w:spacing w:after="70"/>
+      </w:pPr>
+      <w:r>
+        <w:rPr>
+          <w:rFonts w:ascii="Arial" w:cs="Arial" w:eastAsia="Arial" w:hAnsi="Arial"/>
+          <w:b/>
+          <w:bCs/>
+          <w:sz w:val="22"/>
+          <w:szCs w:val="22"/>
+        </w:rPr>
+        <w:t xml:space="preserve">Tên dự án: </w:t>
+      </w:r>
+      <w:r>
+        <w:rPr>
+          <w:rFonts w:ascii="Arial" w:cs="Arial" w:eastAsia="Arial" w:hAnsi="Arial"/>
+          <w:sz w:val="22"/>
+          <w:szCs w:val="22"/>
+        </w:rPr>
+        <w:t xml:space="preserve">repo rolling-door-ble, gồm thư mục android (package com.trananh.rollingdoor) và firmware (PlatformIO).</w:t>
       </w:r>
     </w:p>
     <w:p>

</xml_diff>